<commit_message>
docs: actualiza capturas de pantalla y documento PDF
</commit_message>
<xml_diff>
--- a/Actividad_1_Grazón_Jairon.docx
+++ b/Actividad_1_Grazón_Jairon.docx
@@ -1019,13 +1019,23 @@
           </wp:anchor>
         </w:drawing>
       </w:r>
+      <w:proofErr w:type="gramStart"/>
       <w:r>
         <w:rPr>
           <w:rFonts w:ascii="Arial" w:hAnsi="Arial" w:cs="Arial"/>
           <w:b/>
           <w:sz w:val="28"/>
         </w:rPr>
-        <w:t xml:space="preserve">Actividades a desarrollar en la </w:t>
+        <w:t>Actividades a desarrollar</w:t>
+      </w:r>
+      <w:proofErr w:type="gramEnd"/>
+      <w:r>
+        <w:rPr>
+          <w:rFonts w:ascii="Arial" w:hAnsi="Arial" w:cs="Arial"/>
+          <w:b/>
+          <w:sz w:val="28"/>
+        </w:rPr>
+        <w:t xml:space="preserve"> en la </w:t>
       </w:r>
       <w:r>
         <w:rPr>
@@ -2986,33 +2996,37 @@
           <w:tab w:val="num" w:pos="-709"/>
         </w:tabs>
         <w:spacing w:after="0" w:line="240" w:lineRule="auto"/>
-        <w:ind w:left="-426" w:hanging="425"/>
+        <w:ind w:left="-426" w:hanging="283"/>
         <w:rPr>
           <w:rFonts w:eastAsia="Calibri"/>
           <w:sz w:val="28"/>
           <w:szCs w:val="28"/>
         </w:rPr>
       </w:pPr>
-      <w:r>
+    </w:p>
+    <w:p>
+      <w:pPr>
+        <w:tabs>
+          <w:tab w:val="num" w:pos="-709"/>
+        </w:tabs>
+        <w:spacing w:after="0" w:line="240" w:lineRule="auto"/>
         <w:rPr>
           <w:rFonts w:eastAsia="Calibri"/>
           <w:sz w:val="28"/>
           <w:szCs w:val="28"/>
         </w:rPr>
-        <w:t xml:space="preserve"> </w:t>
-      </w:r>
-      <w:r>
-        <w:rPr>
-          <w:rFonts w:eastAsia="Calibri"/>
-          <w:noProof/>
+      </w:pPr>
+      <w:r>
+        <w:rPr>
+          <w:rFonts w:eastAsia="Calibri"/>
           <w:sz w:val="28"/>
           <w:szCs w:val="28"/>
         </w:rPr>
         <w:drawing>
-          <wp:inline distT="0" distB="0" distL="0" distR="0" wp14:anchorId="42BB5CE8" wp14:editId="79F80A33">
-            <wp:extent cx="6305107" cy="3126604"/>
-            <wp:effectExtent l="0" t="0" r="635" b="0"/>
-            <wp:docPr id="856505754" name="Imagen 1"/>
+          <wp:inline distT="0" distB="0" distL="0" distR="0" wp14:anchorId="3109F604" wp14:editId="28A95ACA">
+            <wp:extent cx="6086475" cy="2993137"/>
+            <wp:effectExtent l="0" t="0" r="0" b="0"/>
+            <wp:docPr id="371719987" name="Imagen 1"/>
             <wp:cNvGraphicFramePr>
               <a:graphicFrameLocks xmlns:a="http://schemas.openxmlformats.org/drawingml/2006/main" noChangeAspect="1"/>
             </wp:cNvGraphicFramePr>
@@ -3020,7 +3034,7 @@
               <a:graphicData uri="http://schemas.openxmlformats.org/drawingml/2006/picture">
                 <pic:pic xmlns:pic="http://schemas.openxmlformats.org/drawingml/2006/picture">
                   <pic:nvPicPr>
-                    <pic:cNvPr id="856505754" name=""/>
+                    <pic:cNvPr id="371719987" name=""/>
                     <pic:cNvPicPr/>
                   </pic:nvPicPr>
                   <pic:blipFill>
@@ -3032,7 +3046,7 @@
                   <pic:spPr>
                     <a:xfrm>
                       <a:off x="0" y="0"/>
-                      <a:ext cx="6305107" cy="3126604"/>
+                      <a:ext cx="6106912" cy="3003187"/>
                     </a:xfrm>
                     <a:prstGeom prst="rect">
                       <a:avLst/>
@@ -3069,20 +3083,32 @@
           <w:sz w:val="28"/>
           <w:szCs w:val="28"/>
         </w:rPr>
-        <w:t xml:space="preserve"> </w:t>
-      </w:r>
-      <w:r>
-        <w:rPr>
-          <w:rFonts w:eastAsia="Calibri"/>
-          <w:noProof/>
+        <w:t xml:space="preserve">  </w:t>
+      </w:r>
+    </w:p>
+    <w:p>
+      <w:pPr>
+        <w:tabs>
+          <w:tab w:val="num" w:pos="-709"/>
+        </w:tabs>
+        <w:spacing w:after="0" w:line="240" w:lineRule="auto"/>
+        <w:rPr>
+          <w:rFonts w:eastAsia="Calibri"/>
           <w:sz w:val="28"/>
           <w:szCs w:val="28"/>
         </w:rPr>
+      </w:pPr>
+      <w:r>
+        <w:rPr>
+          <w:rFonts w:eastAsia="Calibri"/>
+          <w:sz w:val="28"/>
+          <w:szCs w:val="28"/>
+        </w:rPr>
         <w:drawing>
-          <wp:inline distT="0" distB="0" distL="0" distR="0" wp14:anchorId="66DF2FB1" wp14:editId="1B359576">
-            <wp:extent cx="6603273" cy="3083442"/>
-            <wp:effectExtent l="0" t="0" r="7620" b="3175"/>
-            <wp:docPr id="964500015" name="Imagen 1"/>
+          <wp:inline distT="0" distB="0" distL="0" distR="0" wp14:anchorId="3DE8D412" wp14:editId="2BEB255D">
+            <wp:extent cx="6086475" cy="3043238"/>
+            <wp:effectExtent l="0" t="0" r="0" b="5080"/>
+            <wp:docPr id="740393578" name="Imagen 1"/>
             <wp:cNvGraphicFramePr>
               <a:graphicFrameLocks xmlns:a="http://schemas.openxmlformats.org/drawingml/2006/main" noChangeAspect="1"/>
             </wp:cNvGraphicFramePr>
@@ -3090,7 +3116,7 @@
               <a:graphicData uri="http://schemas.openxmlformats.org/drawingml/2006/picture">
                 <pic:pic xmlns:pic="http://schemas.openxmlformats.org/drawingml/2006/picture">
                   <pic:nvPicPr>
-                    <pic:cNvPr id="964500015" name=""/>
+                    <pic:cNvPr id="740393578" name=""/>
                     <pic:cNvPicPr/>
                   </pic:nvPicPr>
                   <pic:blipFill>
@@ -3102,7 +3128,7 @@
                   <pic:spPr>
                     <a:xfrm>
                       <a:off x="0" y="0"/>
-                      <a:ext cx="6636755" cy="3099077"/>
+                      <a:ext cx="6089221" cy="3044611"/>
                     </a:xfrm>
                     <a:prstGeom prst="rect">
                       <a:avLst/>
@@ -3124,6 +3150,29 @@
           <w:rFonts w:ascii="Arial" w:hAnsi="Arial" w:cs="Arial"/>
           <w:b/>
           <w:bCs/>
+          <w:lang w:eastAsia="es-EC"/>
+        </w:rPr>
+      </w:pPr>
+    </w:p>
+    <w:p>
+      <w:pPr>
+        <w:widowControl w:val="0"/>
+        <w:pBdr>
+          <w:top w:val="nil"/>
+          <w:left w:val="nil"/>
+          <w:bottom w:val="nil"/>
+          <w:right w:val="nil"/>
+          <w:between w:val="nil"/>
+        </w:pBdr>
+        <w:spacing w:after="0" w:line="240" w:lineRule="auto"/>
+        <w:jc w:val="both"/>
+        <w:rPr>
+          <w:rFonts w:ascii="Arial" w:eastAsiaTheme="majorEastAsia" w:hAnsi="Arial" w:cs="Arial"/>
+          <w:b/>
+          <w:bCs/>
+          <w:color w:val="2F5496" w:themeColor="accent1" w:themeShade="BF"/>
+          <w:sz w:val="24"/>
+          <w:szCs w:val="24"/>
           <w:lang w:eastAsia="es-EC"/>
         </w:rPr>
       </w:pPr>
@@ -3318,7 +3367,27 @@
                   <w:szCs w:val="20"/>
                   <w:lang w:eastAsia="es-EC"/>
                 </w:rPr>
-                <w:t xml:space="preserve"> (2014). Pro Git (2.ª ed.). </w:t>
+                <w:t xml:space="preserve"> (2014). </w:t>
+              </w:r>
+              <w:proofErr w:type="gramStart"/>
+              <w:r>
+                <w:rPr>
+                  <w:rFonts w:ascii="Arial" w:hAnsi="Arial" w:cs="Arial"/>
+                  <w:sz w:val="20"/>
+                  <w:szCs w:val="20"/>
+                  <w:lang w:eastAsia="es-EC"/>
+                </w:rPr>
+                <w:t>Pro Git</w:t>
+              </w:r>
+              <w:proofErr w:type="gramEnd"/>
+              <w:r>
+                <w:rPr>
+                  <w:rFonts w:ascii="Arial" w:hAnsi="Arial" w:cs="Arial"/>
+                  <w:sz w:val="20"/>
+                  <w:szCs w:val="20"/>
+                  <w:lang w:eastAsia="es-EC"/>
+                </w:rPr>
+                <w:t xml:space="preserve"> (2.ª ed.). </w:t>
               </w:r>
               <w:proofErr w:type="spellStart"/>
               <w:r>

</xml_diff>